<commit_message>
07.9: buổi làm việc 01/7/2026 chỉ trình bày, không nộp tài liệu
Mục về thông tin, tài liệu, chứng cứ do người tố cáo cung cấp ghi "bốn lần",
trong đó có "tập tài liệu tại buổi làm việc ngày 01/7/2026". Ngày 01/7 người
lập hồ sơ chỉ trình bày trực tiếp, không nộp tài liệu, nên sửa thành ba lần
có chứng từ tiếp nhận. Số trang không đổi (64).

Co-Authored-By: Claude Opus 5.5 <noreply@anthropic.com>
Claude-Session: https://claude.ai/code/session_015JTqgRgcwweC4y1McBEsCj
</commit_message>
<xml_diff>
--- a/07.9 - Bao cao sai pham Phieu huong dan 2960 va Cong van 3292.docx
+++ b/07.9 - Bao cao sai pham Phieu huong dan 2960 va Cong van 3292.docx
@@ -15206,7 +15206,7 @@
         <w:t xml:space="preserve">thông tin, tài liệu, chứng cứ do người tố cáo cung cấp</w:t>
       </w:r>
       <w:r>
-        <w:t xml:space="preserve">. Tôi đã cung cấp bốn lần trong hơn chín tuần, mỗi lần đều có chứng từ tiếp nhận: ba đơn tháng 5/2026 kèm phụ lục; tập tài liệu tại buổi làm việc ngày 01/7/2026; Hồ sơ tố cáo kèm thẻ nhớ USB, phường nhận ngày 09/7/2026; và Phụ lục 5 — bảng so sánh từng nội dung Đơn khiếu nại với Công văn số 87/THCSTP — phường nhận ngày 19/7/2026. Ba trang Thông báo 5553 nêu đúng</w:t>
+        <w:t xml:space="preserve">. Tôi đã cung cấp ba lần trong hơn chín tuần, mỗi lần đều có chứng từ tiếp nhận: ba đơn tháng 5/2026 kèm phụ lục; Hồ sơ tố cáo kèm thẻ nhớ USB, phường nhận ngày 09/7/2026; và Phụ lục 5 — bảng so sánh từng nội dung Đơn khiếu nại với Công văn số 87/THCSTP — phường nhận ngày 19/7/2026. Ba trang Thông báo 5553 nêu đúng</w:t>
       </w:r>
       <w:r>
         <w:t xml:space="preserve"> </w:t>
@@ -15254,7 +15254,7 @@
         <w:t xml:space="preserve">”</w:t>
       </w:r>
       <w:r>
-        <w:t xml:space="preserve">. Không tài liệu nào trong bốn lần trên được nêu tên. Nghĩa là điều kiện mà chính Thông báo 5553 chép ra để làm căn cứ lại được xét bằng tài liệu của bên bị tố cáo, không bằng tài liệu của người tố cáo mà điều luật nhắc tới.</w:t>
+        <w:t xml:space="preserve">. Không tài liệu nào trong ba lần trên được nêu tên. Nghĩa là điều kiện mà chính Thông báo 5553 chép ra để làm căn cứ lại được xét bằng tài liệu của bên bị tố cáo, không bằng tài liệu của người tố cáo mà điều luật nhắc tới.</w:t>
       </w:r>
     </w:p>
     <w:p>

</xml_diff>

<commit_message>
07.9: bỏ lập luận "đảo chủ ngữ" ở ba ô bảng về Công văn 87
Câu Công văn 87 và bản góp ý dự giờ (13.1) cùng có vế "dễ gây nhầm
lẫn cho học sinh", nên câu ấy vẫn đọc tự nhiên là nhận xét về tiết dạy.
Giữ phần có căn cứ: cắt bốn trong năm ý góp ý, bỏ tên các đối tượng
kỹ thuật, dùng ý kiến của giáo viên bị khiếu nại làm căn cứ bác bỏ.
Số trang giữ nguyên 65; chỉ trang 29, 41, 43 đổi.

Co-Authored-By: Claude Opus 5.5 <noreply@anthropic.com>
Claude-Session: https://claude.ai/code/session_015JTqgRgcwweC4y1McBEsCj
</commit_message>
<xml_diff>
--- a/07.9 - Bao cao sai pham Phieu huong dan 2960 va Cong van 3292.docx
+++ b/07.9 - Bao cao sai pham Phieu huong dan 2960 va Cong van 3292.docx
@@ -15418,7 +15418,7 @@
               <w:rPr>
                 <w:sz w:val="22"/>
               </w:rPr>
-              <w:t xml:space="preserve">Cắt bốn trong năm nội dung góp ý chuyên môn, đảo chủ ngữ câu còn lại, bỏ tên các đối tượng kỹ thuật, dùng ý kiến của chính giáo viên bị khiếu nại làm căn cứ bác bỏ</w:t>
+              <w:t xml:space="preserve">Cắt bốn trong năm nội dung góp ý chuyên môn, bỏ tên các đối tượng kỹ thuật ở câu còn lại, dùng ý kiến của chính giáo viên bị khiếu nại làm căn cứ bác bỏ</w:t>
             </w:r>
           </w:p>
         </w:tc>
@@ -23423,7 +23423,7 @@
               <w:rPr>
                 <w:sz w:val="22"/>
               </w:rPr>
-              <w:t xml:space="preserve">Góp ý chuyên môn của giáo viên dự giờ: bốn trong năm nội dung bị cắt, câu còn lại bị đảo chủ ngữ, tên các đối tượng kỹ thuật bị bỏ, ý kiến của chính giáo viên bị khiếu nại được dùng làm căn cứ bác bỏ</w:t>
+              <w:t xml:space="preserve">Góp ý chuyên môn của giáo viên dự giờ: bốn trong năm nội dung bị cắt, câu còn lại bị bỏ tên các đối tượng kỹ thuật, ý kiến của chính giáo viên bị khiếu nại được dùng làm căn cứ bác bỏ</w:t>
             </w:r>
           </w:p>
         </w:tc>
@@ -25143,7 +25143,7 @@
               <w:rPr>
                 <w:sz w:val="22"/>
               </w:rPr>
-              <w:t xml:space="preserve">qua học sinh do người bị khiếu nại thực hiện là việc bị nêu; III.3: chính kết quả của buổi họp tổ — góp ý bị cắt và đảo chủ ngữ trong Công văn 87 — là việc bị nêu</w:t>
+              <w:t xml:space="preserve">qua học sinh do người bị khiếu nại thực hiện là việc bị nêu; III.3: chính kết quả của buổi họp tổ — góp ý bị cắt bớt trong Công văn 87 — là việc bị nêu</w:t>
             </w:r>
           </w:p>
         </w:tc>

</xml_diff>